<commit_message>
Added Lab6 and outputs
</commit_message>
<xml_diff>
--- a/.NET OUTPUS.docx
+++ b/.NET OUTPUS.docx
@@ -1233,6 +1233,9 @@
         <w:spacing w:before="0" w:after="0"/>
       </w:pPr>
       <w:r>
+        <w:rPr>
+          <w:noProof/>
+        </w:rPr>
         <w:drawing>
           <wp:inline distT="0" distB="0" distL="0" distR="0" wp14:anchorId="70F484CB" wp14:editId="576376C9">
             <wp:extent cx="2468912" cy="1497965"/>
@@ -1270,6 +1273,9 @@
         </w:drawing>
       </w:r>
       <w:r>
+        <w:rPr>
+          <w:noProof/>
+        </w:rPr>
         <w:drawing>
           <wp:inline distT="0" distB="0" distL="0" distR="0" wp14:anchorId="16099EF7" wp14:editId="28B85BF3">
             <wp:extent cx="2492736" cy="1511088"/>
@@ -1325,6 +1331,9 @@
         <w:spacing w:before="0" w:after="0"/>
       </w:pPr>
       <w:r>
+        <w:rPr>
+          <w:noProof/>
+        </w:rPr>
         <w:drawing>
           <wp:anchor distT="0" distB="0" distL="114300" distR="114300" simplePos="0" relativeHeight="251658240" behindDoc="0" locked="0" layoutInCell="1" allowOverlap="1" wp14:anchorId="372938FD" wp14:editId="7B4BD6D9">
             <wp:simplePos x="0" y="0"/>
@@ -1382,8 +1391,11 @@
         </w:drawing>
       </w:r>
       <w:r>
+        <w:rPr>
+          <w:noProof/>
+        </w:rPr>
         <w:drawing>
-          <wp:anchor distT="0" distB="0" distL="114300" distR="114300" simplePos="0" relativeHeight="251659264" behindDoc="0" locked="0" layoutInCell="1" allowOverlap="1" wp14:anchorId="11F008D1" wp14:editId="3D90E91D">
+          <wp:anchor distT="0" distB="0" distL="114300" distR="114300" simplePos="0" relativeHeight="251659264" behindDoc="0" locked="0" layoutInCell="1" allowOverlap="1" wp14:anchorId="11F008D1" wp14:editId="32CB123F">
             <wp:simplePos x="0" y="0"/>
             <wp:positionH relativeFrom="margin">
               <wp:align>left</wp:align>
@@ -1476,6 +1488,9 @@
         <w:spacing w:before="0" w:after="0"/>
       </w:pPr>
       <w:r>
+        <w:rPr>
+          <w:noProof/>
+        </w:rPr>
         <w:drawing>
           <wp:inline distT="0" distB="0" distL="0" distR="0" wp14:anchorId="3A3440AF" wp14:editId="5CC350A3">
             <wp:extent cx="2624203" cy="1596390"/>
@@ -1513,6 +1528,9 @@
         </w:drawing>
       </w:r>
       <w:r>
+        <w:rPr>
+          <w:noProof/>
+        </w:rPr>
         <w:drawing>
           <wp:inline distT="0" distB="0" distL="0" distR="0" wp14:anchorId="3C02F62D" wp14:editId="67EC9716">
             <wp:extent cx="2661411" cy="1600828"/>
@@ -1594,6 +1612,9 @@
         <w:spacing w:before="0" w:after="0"/>
       </w:pPr>
       <w:r>
+        <w:rPr>
+          <w:noProof/>
+        </w:rPr>
         <w:drawing>
           <wp:inline distT="0" distB="0" distL="0" distR="0" wp14:anchorId="2B2E51FA" wp14:editId="5F640B66">
             <wp:extent cx="2634231" cy="1607556"/>
@@ -1631,6 +1652,9 @@
         </w:drawing>
       </w:r>
       <w:r>
+        <w:rPr>
+          <w:noProof/>
+        </w:rPr>
         <w:drawing>
           <wp:inline distT="0" distB="0" distL="0" distR="0" wp14:anchorId="25F3CDE6" wp14:editId="40680801">
             <wp:extent cx="2645677" cy="1602105"/>
@@ -1668,6 +1692,9 @@
         </w:drawing>
       </w:r>
       <w:r>
+        <w:rPr>
+          <w:noProof/>
+        </w:rPr>
         <w:drawing>
           <wp:inline distT="0" distB="0" distL="0" distR="0" wp14:anchorId="1A9D6010" wp14:editId="6D710639">
             <wp:extent cx="2625388" cy="1588416"/>
@@ -1705,6 +1732,9 @@
         </w:drawing>
       </w:r>
       <w:r>
+        <w:rPr>
+          <w:noProof/>
+        </w:rPr>
         <w:drawing>
           <wp:inline distT="0" distB="0" distL="0" distR="0" wp14:anchorId="6B8C0D04" wp14:editId="32709731">
             <wp:extent cx="2653030" cy="1587283"/>
@@ -1742,6 +1772,9 @@
         </w:drawing>
       </w:r>
       <w:r>
+        <w:rPr>
+          <w:noProof/>
+        </w:rPr>
         <w:drawing>
           <wp:inline distT="0" distB="0" distL="0" distR="0" wp14:anchorId="075C1CC8" wp14:editId="5E6CA8DF">
             <wp:extent cx="2636520" cy="1600503"/>
@@ -1797,6 +1830,9 @@
         <w:spacing w:before="0" w:after="0"/>
       </w:pPr>
       <w:r>
+        <w:rPr>
+          <w:noProof/>
+        </w:rPr>
         <w:drawing>
           <wp:inline distT="0" distB="0" distL="0" distR="0" wp14:anchorId="1F23FFD1" wp14:editId="2C6F8A1A">
             <wp:extent cx="2676504" cy="1629351"/>
@@ -1834,6 +1870,9 @@
         </w:drawing>
       </w:r>
       <w:r>
+        <w:rPr>
+          <w:noProof/>
+        </w:rPr>
         <w:drawing>
           <wp:inline distT="0" distB="0" distL="0" distR="0" wp14:anchorId="63332739" wp14:editId="6D7FE695">
             <wp:extent cx="2716656" cy="1649730"/>
@@ -1870,6 +1909,457 @@
           </wp:inline>
         </w:drawing>
       </w:r>
+    </w:p>
+    <w:p>
+      <w:pPr>
+        <w:spacing w:before="0" w:after="0"/>
+      </w:pPr>
+    </w:p>
+    <w:p>
+      <w:pPr>
+        <w:spacing w:before="0" w:after="0"/>
+      </w:pPr>
+    </w:p>
+    <w:p>
+      <w:pPr>
+        <w:spacing w:before="0" w:after="0"/>
+        <w:rPr>
+          <w:sz w:val="32"/>
+          <w:szCs w:val="28"/>
+        </w:rPr>
+      </w:pPr>
+      <w:r>
+        <w:rPr>
+          <w:sz w:val="32"/>
+          <w:szCs w:val="28"/>
+        </w:rPr>
+        <w:lastRenderedPageBreak/>
+        <w:t>Lab 6 Outputs</w:t>
+      </w:r>
+    </w:p>
+    <w:p>
+      <w:pPr>
+        <w:spacing w:before="0" w:after="0"/>
+      </w:pPr>
+      <w:r>
+        <w:t>Qn.1</w:t>
+      </w:r>
+    </w:p>
+    <w:p>
+      <w:pPr>
+        <w:spacing w:before="0" w:after="0"/>
+      </w:pPr>
+      <w:r>
+        <w:drawing>
+          <wp:inline distT="0" distB="0" distL="0" distR="0" wp14:anchorId="7A42C13E" wp14:editId="20B6DBE0">
+            <wp:extent cx="2533581" cy="1529080"/>
+            <wp:effectExtent l="0" t="0" r="635" b="0"/>
+            <wp:docPr id="1999635594" name="Picture 1"/>
+            <wp:cNvGraphicFramePr>
+              <a:graphicFrameLocks xmlns:a="http://schemas.openxmlformats.org/drawingml/2006/main" noChangeAspect="1"/>
+            </wp:cNvGraphicFramePr>
+            <a:graphic xmlns:a="http://schemas.openxmlformats.org/drawingml/2006/main">
+              <a:graphicData uri="http://schemas.openxmlformats.org/drawingml/2006/picture">
+                <pic:pic xmlns:pic="http://schemas.openxmlformats.org/drawingml/2006/picture">
+                  <pic:nvPicPr>
+                    <pic:cNvPr id="1999635594" name=""/>
+                    <pic:cNvPicPr/>
+                  </pic:nvPicPr>
+                  <pic:blipFill>
+                    <a:blip r:embed="rId36"/>
+                    <a:stretch>
+                      <a:fillRect/>
+                    </a:stretch>
+                  </pic:blipFill>
+                  <pic:spPr>
+                    <a:xfrm>
+                      <a:off x="0" y="0"/>
+                      <a:ext cx="2549285" cy="1538557"/>
+                    </a:xfrm>
+                    <a:prstGeom prst="rect">
+                      <a:avLst/>
+                    </a:prstGeom>
+                  </pic:spPr>
+                </pic:pic>
+              </a:graphicData>
+            </a:graphic>
+          </wp:inline>
+        </w:drawing>
+      </w:r>
+      <w:r>
+        <w:drawing>
+          <wp:inline distT="0" distB="0" distL="0" distR="0" wp14:anchorId="02403130" wp14:editId="59CC269C">
+            <wp:extent cx="2478403" cy="1516698"/>
+            <wp:effectExtent l="0" t="0" r="0" b="7620"/>
+            <wp:docPr id="581159066" name="Picture 1"/>
+            <wp:cNvGraphicFramePr>
+              <a:graphicFrameLocks xmlns:a="http://schemas.openxmlformats.org/drawingml/2006/main" noChangeAspect="1"/>
+            </wp:cNvGraphicFramePr>
+            <a:graphic xmlns:a="http://schemas.openxmlformats.org/drawingml/2006/main">
+              <a:graphicData uri="http://schemas.openxmlformats.org/drawingml/2006/picture">
+                <pic:pic xmlns:pic="http://schemas.openxmlformats.org/drawingml/2006/picture">
+                  <pic:nvPicPr>
+                    <pic:cNvPr id="581159066" name=""/>
+                    <pic:cNvPicPr/>
+                  </pic:nvPicPr>
+                  <pic:blipFill>
+                    <a:blip r:embed="rId37"/>
+                    <a:stretch>
+                      <a:fillRect/>
+                    </a:stretch>
+                  </pic:blipFill>
+                  <pic:spPr>
+                    <a:xfrm>
+                      <a:off x="0" y="0"/>
+                      <a:ext cx="2492997" cy="1525629"/>
+                    </a:xfrm>
+                    <a:prstGeom prst="rect">
+                      <a:avLst/>
+                    </a:prstGeom>
+                  </pic:spPr>
+                </pic:pic>
+              </a:graphicData>
+            </a:graphic>
+          </wp:inline>
+        </w:drawing>
+      </w:r>
+    </w:p>
+    <w:p>
+      <w:pPr>
+        <w:spacing w:before="0" w:after="0"/>
+      </w:pPr>
+      <w:r>
+        <w:drawing>
+          <wp:inline distT="0" distB="0" distL="0" distR="0" wp14:anchorId="46499639" wp14:editId="119482D4">
+            <wp:extent cx="5024438" cy="1388699"/>
+            <wp:effectExtent l="0" t="0" r="5080" b="2540"/>
+            <wp:docPr id="1214104193" name="Picture 1"/>
+            <wp:cNvGraphicFramePr>
+              <a:graphicFrameLocks xmlns:a="http://schemas.openxmlformats.org/drawingml/2006/main" noChangeAspect="1"/>
+            </wp:cNvGraphicFramePr>
+            <a:graphic xmlns:a="http://schemas.openxmlformats.org/drawingml/2006/main">
+              <a:graphicData uri="http://schemas.openxmlformats.org/drawingml/2006/picture">
+                <pic:pic xmlns:pic="http://schemas.openxmlformats.org/drawingml/2006/picture">
+                  <pic:nvPicPr>
+                    <pic:cNvPr id="1214104193" name=""/>
+                    <pic:cNvPicPr/>
+                  </pic:nvPicPr>
+                  <pic:blipFill>
+                    <a:blip r:embed="rId38"/>
+                    <a:stretch>
+                      <a:fillRect/>
+                    </a:stretch>
+                  </pic:blipFill>
+                  <pic:spPr>
+                    <a:xfrm>
+                      <a:off x="0" y="0"/>
+                      <a:ext cx="5059244" cy="1398319"/>
+                    </a:xfrm>
+                    <a:prstGeom prst="rect">
+                      <a:avLst/>
+                    </a:prstGeom>
+                  </pic:spPr>
+                </pic:pic>
+              </a:graphicData>
+            </a:graphic>
+          </wp:inline>
+        </w:drawing>
+      </w:r>
+    </w:p>
+    <w:p>
+      <w:pPr>
+        <w:spacing w:before="0" w:after="0"/>
+      </w:pPr>
+    </w:p>
+    <w:p>
+      <w:pPr>
+        <w:spacing w:before="0" w:after="0"/>
+      </w:pPr>
+      <w:r>
+        <w:t>Qn.2</w:t>
+      </w:r>
+    </w:p>
+    <w:p>
+      <w:pPr>
+        <w:spacing w:before="0" w:after="0"/>
+      </w:pPr>
+      <w:r>
+        <w:drawing>
+          <wp:inline distT="0" distB="0" distL="0" distR="0" wp14:anchorId="57C68388" wp14:editId="1CB9BD1D">
+            <wp:extent cx="2857831" cy="1711645"/>
+            <wp:effectExtent l="0" t="0" r="0" b="3175"/>
+            <wp:docPr id="1511322389" name="Picture 1"/>
+            <wp:cNvGraphicFramePr>
+              <a:graphicFrameLocks xmlns:a="http://schemas.openxmlformats.org/drawingml/2006/main" noChangeAspect="1"/>
+            </wp:cNvGraphicFramePr>
+            <a:graphic xmlns:a="http://schemas.openxmlformats.org/drawingml/2006/main">
+              <a:graphicData uri="http://schemas.openxmlformats.org/drawingml/2006/picture">
+                <pic:pic xmlns:pic="http://schemas.openxmlformats.org/drawingml/2006/picture">
+                  <pic:nvPicPr>
+                    <pic:cNvPr id="1511322389" name=""/>
+                    <pic:cNvPicPr/>
+                  </pic:nvPicPr>
+                  <pic:blipFill>
+                    <a:blip r:embed="rId39"/>
+                    <a:stretch>
+                      <a:fillRect/>
+                    </a:stretch>
+                  </pic:blipFill>
+                  <pic:spPr>
+                    <a:xfrm>
+                      <a:off x="0" y="0"/>
+                      <a:ext cx="2868100" cy="1717795"/>
+                    </a:xfrm>
+                    <a:prstGeom prst="rect">
+                      <a:avLst/>
+                    </a:prstGeom>
+                  </pic:spPr>
+                </pic:pic>
+              </a:graphicData>
+            </a:graphic>
+          </wp:inline>
+        </w:drawing>
+      </w:r>
+      <w:r>
+        <w:drawing>
+          <wp:inline distT="0" distB="0" distL="0" distR="0" wp14:anchorId="2799A652" wp14:editId="625E44C1">
+            <wp:extent cx="2866118" cy="1719671"/>
+            <wp:effectExtent l="0" t="0" r="0" b="0"/>
+            <wp:docPr id="265821441" name="Picture 1"/>
+            <wp:cNvGraphicFramePr>
+              <a:graphicFrameLocks xmlns:a="http://schemas.openxmlformats.org/drawingml/2006/main" noChangeAspect="1"/>
+            </wp:cNvGraphicFramePr>
+            <a:graphic xmlns:a="http://schemas.openxmlformats.org/drawingml/2006/main">
+              <a:graphicData uri="http://schemas.openxmlformats.org/drawingml/2006/picture">
+                <pic:pic xmlns:pic="http://schemas.openxmlformats.org/drawingml/2006/picture">
+                  <pic:nvPicPr>
+                    <pic:cNvPr id="265821441" name=""/>
+                    <pic:cNvPicPr/>
+                  </pic:nvPicPr>
+                  <pic:blipFill>
+                    <a:blip r:embed="rId40"/>
+                    <a:stretch>
+                      <a:fillRect/>
+                    </a:stretch>
+                  </pic:blipFill>
+                  <pic:spPr>
+                    <a:xfrm>
+                      <a:off x="0" y="0"/>
+                      <a:ext cx="2876252" cy="1725752"/>
+                    </a:xfrm>
+                    <a:prstGeom prst="rect">
+                      <a:avLst/>
+                    </a:prstGeom>
+                  </pic:spPr>
+                </pic:pic>
+              </a:graphicData>
+            </a:graphic>
+          </wp:inline>
+        </w:drawing>
+      </w:r>
+    </w:p>
+    <w:p>
+      <w:pPr>
+        <w:spacing w:before="0" w:after="0"/>
+      </w:pPr>
+    </w:p>
+    <w:p>
+      <w:pPr>
+        <w:spacing w:before="0" w:after="0"/>
+      </w:pPr>
+      <w:r>
+        <w:t>Qn.3</w:t>
+      </w:r>
+    </w:p>
+    <w:p>
+      <w:pPr>
+        <w:spacing w:before="0" w:after="0"/>
+      </w:pPr>
+      <w:r>
+        <w:drawing>
+          <wp:inline distT="0" distB="0" distL="0" distR="0" wp14:anchorId="12F89391" wp14:editId="50182086">
+            <wp:extent cx="2675467" cy="1628434"/>
+            <wp:effectExtent l="0" t="0" r="4445" b="0"/>
+            <wp:docPr id="1339773200" name="Picture 1"/>
+            <wp:cNvGraphicFramePr>
+              <a:graphicFrameLocks xmlns:a="http://schemas.openxmlformats.org/drawingml/2006/main" noChangeAspect="1"/>
+            </wp:cNvGraphicFramePr>
+            <a:graphic xmlns:a="http://schemas.openxmlformats.org/drawingml/2006/main">
+              <a:graphicData uri="http://schemas.openxmlformats.org/drawingml/2006/picture">
+                <pic:pic xmlns:pic="http://schemas.openxmlformats.org/drawingml/2006/picture">
+                  <pic:nvPicPr>
+                    <pic:cNvPr id="1339773200" name=""/>
+                    <pic:cNvPicPr/>
+                  </pic:nvPicPr>
+                  <pic:blipFill>
+                    <a:blip r:embed="rId41"/>
+                    <a:stretch>
+                      <a:fillRect/>
+                    </a:stretch>
+                  </pic:blipFill>
+                  <pic:spPr>
+                    <a:xfrm>
+                      <a:off x="0" y="0"/>
+                      <a:ext cx="2675467" cy="1628434"/>
+                    </a:xfrm>
+                    <a:prstGeom prst="rect">
+                      <a:avLst/>
+                    </a:prstGeom>
+                  </pic:spPr>
+                </pic:pic>
+              </a:graphicData>
+            </a:graphic>
+          </wp:inline>
+        </w:drawing>
+      </w:r>
+      <w:r>
+        <w:drawing>
+          <wp:inline distT="0" distB="0" distL="0" distR="0" wp14:anchorId="2D9AE11C" wp14:editId="08481346">
+            <wp:extent cx="2718317" cy="1627505"/>
+            <wp:effectExtent l="0" t="0" r="6350" b="0"/>
+            <wp:docPr id="1840884084" name="Picture 1"/>
+            <wp:cNvGraphicFramePr>
+              <a:graphicFrameLocks xmlns:a="http://schemas.openxmlformats.org/drawingml/2006/main" noChangeAspect="1"/>
+            </wp:cNvGraphicFramePr>
+            <a:graphic xmlns:a="http://schemas.openxmlformats.org/drawingml/2006/main">
+              <a:graphicData uri="http://schemas.openxmlformats.org/drawingml/2006/picture">
+                <pic:pic xmlns:pic="http://schemas.openxmlformats.org/drawingml/2006/picture">
+                  <pic:nvPicPr>
+                    <pic:cNvPr id="1840884084" name=""/>
+                    <pic:cNvPicPr/>
+                  </pic:nvPicPr>
+                  <pic:blipFill>
+                    <a:blip r:embed="rId42"/>
+                    <a:stretch>
+                      <a:fillRect/>
+                    </a:stretch>
+                  </pic:blipFill>
+                  <pic:spPr>
+                    <a:xfrm>
+                      <a:off x="0" y="0"/>
+                      <a:ext cx="2718317" cy="1627505"/>
+                    </a:xfrm>
+                    <a:prstGeom prst="rect">
+                      <a:avLst/>
+                    </a:prstGeom>
+                  </pic:spPr>
+                </pic:pic>
+              </a:graphicData>
+            </a:graphic>
+          </wp:inline>
+        </w:drawing>
+      </w:r>
+    </w:p>
+    <w:p>
+      <w:pPr>
+        <w:spacing w:before="0" w:after="0"/>
+      </w:pPr>
+      <w:r>
+        <w:lastRenderedPageBreak/>
+        <w:t>Qn.4</w:t>
+      </w:r>
+    </w:p>
+    <w:p>
+      <w:pPr>
+        <w:spacing w:before="0" w:after="0"/>
+      </w:pPr>
+      <w:r>
+        <w:drawing>
+          <wp:inline distT="0" distB="0" distL="0" distR="0" wp14:anchorId="72EADD30" wp14:editId="1A2F12AA">
+            <wp:extent cx="2946239" cy="1781908"/>
+            <wp:effectExtent l="0" t="0" r="6985" b="8890"/>
+            <wp:docPr id="222364064" name="Picture 1"/>
+            <wp:cNvGraphicFramePr>
+              <a:graphicFrameLocks xmlns:a="http://schemas.openxmlformats.org/drawingml/2006/main" noChangeAspect="1"/>
+            </wp:cNvGraphicFramePr>
+            <a:graphic xmlns:a="http://schemas.openxmlformats.org/drawingml/2006/main">
+              <a:graphicData uri="http://schemas.openxmlformats.org/drawingml/2006/picture">
+                <pic:pic xmlns:pic="http://schemas.openxmlformats.org/drawingml/2006/picture">
+                  <pic:nvPicPr>
+                    <pic:cNvPr id="222364064" name=""/>
+                    <pic:cNvPicPr/>
+                  </pic:nvPicPr>
+                  <pic:blipFill>
+                    <a:blip r:embed="rId43"/>
+                    <a:stretch>
+                      <a:fillRect/>
+                    </a:stretch>
+                  </pic:blipFill>
+                  <pic:spPr>
+                    <a:xfrm>
+                      <a:off x="0" y="0"/>
+                      <a:ext cx="2962504" cy="1791745"/>
+                    </a:xfrm>
+                    <a:prstGeom prst="rect">
+                      <a:avLst/>
+                    </a:prstGeom>
+                  </pic:spPr>
+                </pic:pic>
+              </a:graphicData>
+            </a:graphic>
+          </wp:inline>
+        </w:drawing>
+      </w:r>
+    </w:p>
+    <w:p>
+      <w:pPr>
+        <w:spacing w:before="0" w:after="0"/>
+      </w:pPr>
+    </w:p>
+    <w:p>
+      <w:pPr>
+        <w:spacing w:before="0" w:after="0"/>
+      </w:pPr>
+      <w:r>
+        <w:t>Qn.5</w:t>
+      </w:r>
+    </w:p>
+    <w:p>
+      <w:pPr>
+        <w:spacing w:before="0" w:after="0"/>
+      </w:pPr>
+      <w:r>
+        <w:drawing>
+          <wp:inline distT="0" distB="0" distL="0" distR="0" wp14:anchorId="7E8F0250" wp14:editId="54F0B357">
+            <wp:extent cx="2919046" cy="1755793"/>
+            <wp:effectExtent l="0" t="0" r="0" b="0"/>
+            <wp:docPr id="1091431732" name="Picture 1"/>
+            <wp:cNvGraphicFramePr>
+              <a:graphicFrameLocks xmlns:a="http://schemas.openxmlformats.org/drawingml/2006/main" noChangeAspect="1"/>
+            </wp:cNvGraphicFramePr>
+            <a:graphic xmlns:a="http://schemas.openxmlformats.org/drawingml/2006/main">
+              <a:graphicData uri="http://schemas.openxmlformats.org/drawingml/2006/picture">
+                <pic:pic xmlns:pic="http://schemas.openxmlformats.org/drawingml/2006/picture">
+                  <pic:nvPicPr>
+                    <pic:cNvPr id="1091431732" name=""/>
+                    <pic:cNvPicPr/>
+                  </pic:nvPicPr>
+                  <pic:blipFill>
+                    <a:blip r:embed="rId44"/>
+                    <a:stretch>
+                      <a:fillRect/>
+                    </a:stretch>
+                  </pic:blipFill>
+                  <pic:spPr>
+                    <a:xfrm>
+                      <a:off x="0" y="0"/>
+                      <a:ext cx="2948071" cy="1773251"/>
+                    </a:xfrm>
+                    <a:prstGeom prst="rect">
+                      <a:avLst/>
+                    </a:prstGeom>
+                  </pic:spPr>
+                </pic:pic>
+              </a:graphicData>
+            </a:graphic>
+          </wp:inline>
+        </w:drawing>
+      </w:r>
+    </w:p>
+    <w:p>
+      <w:pPr>
+        <w:spacing w:before="0" w:after="0"/>
+      </w:pPr>
     </w:p>
     <w:p>
       <w:pPr>

</xml_diff>

<commit_message>
added lab 6 contents and updated the output file
</commit_message>
<xml_diff>
--- a/.NET OUTPUS.docx
+++ b/.NET OUTPUS.docx
@@ -1395,7 +1395,7 @@
           <w:noProof/>
         </w:rPr>
         <w:drawing>
-          <wp:anchor distT="0" distB="0" distL="114300" distR="114300" simplePos="0" relativeHeight="251659264" behindDoc="0" locked="0" layoutInCell="1" allowOverlap="1" wp14:anchorId="11F008D1" wp14:editId="32CB123F">
+          <wp:anchor distT="0" distB="0" distL="114300" distR="114300" simplePos="0" relativeHeight="251659264" behindDoc="0" locked="0" layoutInCell="1" allowOverlap="1" wp14:anchorId="11F008D1" wp14:editId="2F759B75">
             <wp:simplePos x="0" y="0"/>
             <wp:positionH relativeFrom="margin">
               <wp:align>left</wp:align>
@@ -1950,6 +1950,9 @@
         <w:spacing w:before="0" w:after="0"/>
       </w:pPr>
       <w:r>
+        <w:rPr>
+          <w:noProof/>
+        </w:rPr>
         <w:drawing>
           <wp:inline distT="0" distB="0" distL="0" distR="0" wp14:anchorId="7A42C13E" wp14:editId="20B6DBE0">
             <wp:extent cx="2533581" cy="1529080"/>
@@ -1987,6 +1990,9 @@
         </w:drawing>
       </w:r>
       <w:r>
+        <w:rPr>
+          <w:noProof/>
+        </w:rPr>
         <w:drawing>
           <wp:inline distT="0" distB="0" distL="0" distR="0" wp14:anchorId="02403130" wp14:editId="59CC269C">
             <wp:extent cx="2478403" cy="1516698"/>
@@ -2029,6 +2035,9 @@
         <w:spacing w:before="0" w:after="0"/>
       </w:pPr>
       <w:r>
+        <w:rPr>
+          <w:noProof/>
+        </w:rPr>
         <w:drawing>
           <wp:inline distT="0" distB="0" distL="0" distR="0" wp14:anchorId="46499639" wp14:editId="119482D4">
             <wp:extent cx="5024438" cy="1388699"/>
@@ -2084,6 +2093,9 @@
         <w:spacing w:before="0" w:after="0"/>
       </w:pPr>
       <w:r>
+        <w:rPr>
+          <w:noProof/>
+        </w:rPr>
         <w:drawing>
           <wp:inline distT="0" distB="0" distL="0" distR="0" wp14:anchorId="57C68388" wp14:editId="1CB9BD1D">
             <wp:extent cx="2857831" cy="1711645"/>
@@ -2121,6 +2133,9 @@
         </w:drawing>
       </w:r>
       <w:r>
+        <w:rPr>
+          <w:noProof/>
+        </w:rPr>
         <w:drawing>
           <wp:inline distT="0" distB="0" distL="0" distR="0" wp14:anchorId="2799A652" wp14:editId="625E44C1">
             <wp:extent cx="2866118" cy="1719671"/>
@@ -2176,6 +2191,9 @@
         <w:spacing w:before="0" w:after="0"/>
       </w:pPr>
       <w:r>
+        <w:rPr>
+          <w:noProof/>
+        </w:rPr>
         <w:drawing>
           <wp:inline distT="0" distB="0" distL="0" distR="0" wp14:anchorId="12F89391" wp14:editId="50182086">
             <wp:extent cx="2675467" cy="1628434"/>
@@ -2213,6 +2231,9 @@
         </w:drawing>
       </w:r>
       <w:r>
+        <w:rPr>
+          <w:noProof/>
+        </w:rPr>
         <w:drawing>
           <wp:inline distT="0" distB="0" distL="0" distR="0" wp14:anchorId="2D9AE11C" wp14:editId="08481346">
             <wp:extent cx="2718317" cy="1627505"/>
@@ -2265,6 +2286,104 @@
       </w:pPr>
       <w:r>
         <w:drawing>
+          <wp:inline distT="0" distB="0" distL="0" distR="0" wp14:anchorId="60B31AFD" wp14:editId="2EECB375">
+            <wp:extent cx="2945765" cy="1777845"/>
+            <wp:effectExtent l="0" t="0" r="6985" b="0"/>
+            <wp:docPr id="823099762" name="Picture 1"/>
+            <wp:cNvGraphicFramePr>
+              <a:graphicFrameLocks xmlns:a="http://schemas.openxmlformats.org/drawingml/2006/main" noChangeAspect="1"/>
+            </wp:cNvGraphicFramePr>
+            <a:graphic xmlns:a="http://schemas.openxmlformats.org/drawingml/2006/main">
+              <a:graphicData uri="http://schemas.openxmlformats.org/drawingml/2006/picture">
+                <pic:pic xmlns:pic="http://schemas.openxmlformats.org/drawingml/2006/picture">
+                  <pic:nvPicPr>
+                    <pic:cNvPr id="823099762" name=""/>
+                    <pic:cNvPicPr/>
+                  </pic:nvPicPr>
+                  <pic:blipFill>
+                    <a:blip r:embed="rId43"/>
+                    <a:stretch>
+                      <a:fillRect/>
+                    </a:stretch>
+                  </pic:blipFill>
+                  <pic:spPr>
+                    <a:xfrm>
+                      <a:off x="0" y="0"/>
+                      <a:ext cx="2960541" cy="1786762"/>
+                    </a:xfrm>
+                    <a:prstGeom prst="rect">
+                      <a:avLst/>
+                    </a:prstGeom>
+                  </pic:spPr>
+                </pic:pic>
+              </a:graphicData>
+            </a:graphic>
+          </wp:inline>
+        </w:drawing>
+      </w:r>
+      <w:r>
+        <w:drawing>
+          <wp:inline distT="0" distB="0" distL="0" distR="0" wp14:anchorId="0CE06CB7" wp14:editId="042A7202">
+            <wp:extent cx="2916736" cy="1777153"/>
+            <wp:effectExtent l="0" t="0" r="0" b="0"/>
+            <wp:docPr id="443611130" name="Picture 1"/>
+            <wp:cNvGraphicFramePr>
+              <a:graphicFrameLocks xmlns:a="http://schemas.openxmlformats.org/drawingml/2006/main" noChangeAspect="1"/>
+            </wp:cNvGraphicFramePr>
+            <a:graphic xmlns:a="http://schemas.openxmlformats.org/drawingml/2006/main">
+              <a:graphicData uri="http://schemas.openxmlformats.org/drawingml/2006/picture">
+                <pic:pic xmlns:pic="http://schemas.openxmlformats.org/drawingml/2006/picture">
+                  <pic:nvPicPr>
+                    <pic:cNvPr id="443611130" name=""/>
+                    <pic:cNvPicPr/>
+                  </pic:nvPicPr>
+                  <pic:blipFill>
+                    <a:blip r:embed="rId44"/>
+                    <a:stretch>
+                      <a:fillRect/>
+                    </a:stretch>
+                  </pic:blipFill>
+                  <pic:spPr>
+                    <a:xfrm>
+                      <a:off x="0" y="0"/>
+                      <a:ext cx="2963600" cy="1805707"/>
+                    </a:xfrm>
+                    <a:prstGeom prst="rect">
+                      <a:avLst/>
+                    </a:prstGeom>
+                  </pic:spPr>
+                </pic:pic>
+              </a:graphicData>
+            </a:graphic>
+          </wp:inline>
+        </w:drawing>
+      </w:r>
+    </w:p>
+    <w:p>
+      <w:pPr>
+        <w:spacing w:before="0" w:after="0"/>
+      </w:pPr>
+    </w:p>
+    <w:p>
+      <w:pPr>
+        <w:spacing w:before="0" w:after="0"/>
+      </w:pPr>
+      <w:r>
+        <w:t>Qn.</w:t>
+      </w:r>
+      <w:r>
+        <w:t>5</w:t>
+      </w:r>
+    </w:p>
+    <w:p>
+      <w:pPr>
+        <w:spacing w:before="0" w:after="0"/>
+      </w:pPr>
+      <w:r>
+        <w:rPr>
+          <w:noProof/>
+        </w:rPr>
+        <w:drawing>
           <wp:inline distT="0" distB="0" distL="0" distR="0" wp14:anchorId="72EADD30" wp14:editId="1A2F12AA">
             <wp:extent cx="2946239" cy="1781908"/>
             <wp:effectExtent l="0" t="0" r="6985" b="8890"/>
@@ -2280,7 +2399,7 @@
                     <pic:cNvPicPr/>
                   </pic:nvPicPr>
                   <pic:blipFill>
-                    <a:blip r:embed="rId43"/>
+                    <a:blip r:embed="rId45"/>
                     <a:stretch>
                       <a:fillRect/>
                     </a:stretch>
@@ -2311,14 +2430,20 @@
         <w:spacing w:before="0" w:after="0"/>
       </w:pPr>
       <w:r>
-        <w:t>Qn.5</w:t>
-      </w:r>
-    </w:p>
-    <w:p>
-      <w:pPr>
-        <w:spacing w:before="0" w:after="0"/>
-      </w:pPr>
-      <w:r>
+        <w:t>Qn.</w:t>
+      </w:r>
+      <w:r>
+        <w:t>6</w:t>
+      </w:r>
+    </w:p>
+    <w:p>
+      <w:pPr>
+        <w:spacing w:before="0" w:after="0"/>
+      </w:pPr>
+      <w:r>
+        <w:rPr>
+          <w:noProof/>
+        </w:rPr>
         <w:drawing>
           <wp:inline distT="0" distB="0" distL="0" distR="0" wp14:anchorId="7E8F0250" wp14:editId="54F0B357">
             <wp:extent cx="2919046" cy="1755793"/>
@@ -2335,7 +2460,7 @@
                     <pic:cNvPicPr/>
                   </pic:nvPicPr>
                   <pic:blipFill>
-                    <a:blip r:embed="rId44"/>
+                    <a:blip r:embed="rId46"/>
                     <a:stretch>
                       <a:fillRect/>
                     </a:stretch>
@@ -2348,6 +2473,213 @@
                     <a:prstGeom prst="rect">
                       <a:avLst/>
                     </a:prstGeom>
+                  </pic:spPr>
+                </pic:pic>
+              </a:graphicData>
+            </a:graphic>
+          </wp:inline>
+        </w:drawing>
+      </w:r>
+    </w:p>
+    <w:p>
+      <w:pPr>
+        <w:spacing w:before="0" w:after="0"/>
+      </w:pPr>
+    </w:p>
+    <w:p>
+      <w:pPr>
+        <w:spacing w:before="0" w:after="0"/>
+      </w:pPr>
+    </w:p>
+    <w:p>
+      <w:pPr>
+        <w:spacing w:before="0" w:after="0"/>
+      </w:pPr>
+    </w:p>
+    <w:p>
+      <w:pPr>
+        <w:spacing w:before="0" w:after="0"/>
+      </w:pPr>
+    </w:p>
+    <w:p>
+      <w:pPr>
+        <w:spacing w:before="0" w:after="0"/>
+      </w:pPr>
+    </w:p>
+    <w:p>
+      <w:pPr>
+        <w:spacing w:before="0" w:after="0"/>
+      </w:pPr>
+      <w:r>
+        <w:lastRenderedPageBreak/>
+        <w:t>Qn.7</w:t>
+      </w:r>
+    </w:p>
+    <w:p>
+      <w:pPr>
+        <w:spacing w:before="0" w:after="0"/>
+      </w:pPr>
+      <w:r>
+        <w:drawing>
+          <wp:inline distT="0" distB="0" distL="0" distR="0" wp14:anchorId="266F32C0" wp14:editId="47E34B17">
+            <wp:extent cx="4133850" cy="1744961"/>
+            <wp:effectExtent l="19050" t="19050" r="19050" b="27305"/>
+            <wp:docPr id="629026909" name="Picture 1"/>
+            <wp:cNvGraphicFramePr>
+              <a:graphicFrameLocks xmlns:a="http://schemas.openxmlformats.org/drawingml/2006/main" noChangeAspect="1"/>
+            </wp:cNvGraphicFramePr>
+            <a:graphic xmlns:a="http://schemas.openxmlformats.org/drawingml/2006/main">
+              <a:graphicData uri="http://schemas.openxmlformats.org/drawingml/2006/picture">
+                <pic:pic xmlns:pic="http://schemas.openxmlformats.org/drawingml/2006/picture">
+                  <pic:nvPicPr>
+                    <pic:cNvPr id="629026909" name=""/>
+                    <pic:cNvPicPr/>
+                  </pic:nvPicPr>
+                  <pic:blipFill>
+                    <a:blip r:embed="rId47"/>
+                    <a:stretch>
+                      <a:fillRect/>
+                    </a:stretch>
+                  </pic:blipFill>
+                  <pic:spPr>
+                    <a:xfrm>
+                      <a:off x="0" y="0"/>
+                      <a:ext cx="4156992" cy="1754729"/>
+                    </a:xfrm>
+                    <a:prstGeom prst="rect">
+                      <a:avLst/>
+                    </a:prstGeom>
+                    <a:ln>
+                      <a:solidFill>
+                        <a:schemeClr val="tx1"/>
+                      </a:solidFill>
+                    </a:ln>
+                  </pic:spPr>
+                </pic:pic>
+              </a:graphicData>
+            </a:graphic>
+          </wp:inline>
+        </w:drawing>
+      </w:r>
+      <w:r>
+        <w:drawing>
+          <wp:inline distT="0" distB="0" distL="0" distR="0" wp14:anchorId="3ACB44A3" wp14:editId="256932DE">
+            <wp:extent cx="4156710" cy="1724857"/>
+            <wp:effectExtent l="19050" t="19050" r="15240" b="27940"/>
+            <wp:docPr id="727181902" name="Picture 1"/>
+            <wp:cNvGraphicFramePr>
+              <a:graphicFrameLocks xmlns:a="http://schemas.openxmlformats.org/drawingml/2006/main" noChangeAspect="1"/>
+            </wp:cNvGraphicFramePr>
+            <a:graphic xmlns:a="http://schemas.openxmlformats.org/drawingml/2006/main">
+              <a:graphicData uri="http://schemas.openxmlformats.org/drawingml/2006/picture">
+                <pic:pic xmlns:pic="http://schemas.openxmlformats.org/drawingml/2006/picture">
+                  <pic:nvPicPr>
+                    <pic:cNvPr id="727181902" name=""/>
+                    <pic:cNvPicPr/>
+                  </pic:nvPicPr>
+                  <pic:blipFill>
+                    <a:blip r:embed="rId48"/>
+                    <a:stretch>
+                      <a:fillRect/>
+                    </a:stretch>
+                  </pic:blipFill>
+                  <pic:spPr>
+                    <a:xfrm>
+                      <a:off x="0" y="0"/>
+                      <a:ext cx="4182103" cy="1735394"/>
+                    </a:xfrm>
+                    <a:prstGeom prst="rect">
+                      <a:avLst/>
+                    </a:prstGeom>
+                    <a:ln>
+                      <a:solidFill>
+                        <a:schemeClr val="tx1"/>
+                      </a:solidFill>
+                    </a:ln>
+                  </pic:spPr>
+                </pic:pic>
+              </a:graphicData>
+            </a:graphic>
+          </wp:inline>
+        </w:drawing>
+      </w:r>
+      <w:r>
+        <w:drawing>
+          <wp:inline distT="0" distB="0" distL="0" distR="0" wp14:anchorId="75F008AF" wp14:editId="4C5206A0">
+            <wp:extent cx="4169417" cy="1731466"/>
+            <wp:effectExtent l="19050" t="19050" r="21590" b="21590"/>
+            <wp:docPr id="2050934556" name="Picture 1"/>
+            <wp:cNvGraphicFramePr>
+              <a:graphicFrameLocks xmlns:a="http://schemas.openxmlformats.org/drawingml/2006/main" noChangeAspect="1"/>
+            </wp:cNvGraphicFramePr>
+            <a:graphic xmlns:a="http://schemas.openxmlformats.org/drawingml/2006/main">
+              <a:graphicData uri="http://schemas.openxmlformats.org/drawingml/2006/picture">
+                <pic:pic xmlns:pic="http://schemas.openxmlformats.org/drawingml/2006/picture">
+                  <pic:nvPicPr>
+                    <pic:cNvPr id="2050934556" name=""/>
+                    <pic:cNvPicPr/>
+                  </pic:nvPicPr>
+                  <pic:blipFill>
+                    <a:blip r:embed="rId49"/>
+                    <a:stretch>
+                      <a:fillRect/>
+                    </a:stretch>
+                  </pic:blipFill>
+                  <pic:spPr>
+                    <a:xfrm>
+                      <a:off x="0" y="0"/>
+                      <a:ext cx="4198718" cy="1743634"/>
+                    </a:xfrm>
+                    <a:prstGeom prst="rect">
+                      <a:avLst/>
+                    </a:prstGeom>
+                    <a:ln>
+                      <a:solidFill>
+                        <a:schemeClr val="tx1"/>
+                      </a:solidFill>
+                    </a:ln>
+                  </pic:spPr>
+                </pic:pic>
+              </a:graphicData>
+            </a:graphic>
+          </wp:inline>
+        </w:drawing>
+      </w:r>
+      <w:r>
+        <w:drawing>
+          <wp:inline distT="0" distB="0" distL="0" distR="0" wp14:anchorId="75697CA9" wp14:editId="7B4A2852">
+            <wp:extent cx="4175042" cy="1756997"/>
+            <wp:effectExtent l="19050" t="19050" r="16510" b="15240"/>
+            <wp:docPr id="1825746613" name="Picture 1"/>
+            <wp:cNvGraphicFramePr>
+              <a:graphicFrameLocks xmlns:a="http://schemas.openxmlformats.org/drawingml/2006/main" noChangeAspect="1"/>
+            </wp:cNvGraphicFramePr>
+            <a:graphic xmlns:a="http://schemas.openxmlformats.org/drawingml/2006/main">
+              <a:graphicData uri="http://schemas.openxmlformats.org/drawingml/2006/picture">
+                <pic:pic xmlns:pic="http://schemas.openxmlformats.org/drawingml/2006/picture">
+                  <pic:nvPicPr>
+                    <pic:cNvPr id="1825746613" name=""/>
+                    <pic:cNvPicPr/>
+                  </pic:nvPicPr>
+                  <pic:blipFill>
+                    <a:blip r:embed="rId50"/>
+                    <a:stretch>
+                      <a:fillRect/>
+                    </a:stretch>
+                  </pic:blipFill>
+                  <pic:spPr>
+                    <a:xfrm>
+                      <a:off x="0" y="0"/>
+                      <a:ext cx="4192254" cy="1764240"/>
+                    </a:xfrm>
+                    <a:prstGeom prst="rect">
+                      <a:avLst/>
+                    </a:prstGeom>
+                    <a:ln>
+                      <a:solidFill>
+                        <a:schemeClr val="tx1"/>
+                      </a:solidFill>
+                    </a:ln>
                   </pic:spPr>
                 </pic:pic>
               </a:graphicData>

</xml_diff>